<commit_message>
Update docs and diagrams
</commit_message>
<xml_diff>
--- a/01.WORKING_SPACE/3.DangVanHau-25410203/QuyTrinhCSKH.docx
+++ b/01.WORKING_SPACE/3.DangVanHau-25410203/QuyTrinhCSKH.docx
@@ -70,7 +70,7 @@
           <w:noProof/>
         </w:rPr>
         <w:drawing>
-          <wp:inline distT="0" distB="0" distL="0" distR="0" wp14:anchorId="3F709733" wp14:editId="5D655731">
+          <wp:inline distT="0" distB="0" distL="0" distR="0" wp14:anchorId="01149602" wp14:editId="0DCB731E">
             <wp:extent cx="5669280" cy="992124"/>
             <wp:effectExtent l="0" t="0" r="0" b="0"/>
             <wp:docPr id="1" name="Picture 1"/>
@@ -81,7 +81,7 @@
               <a:graphicData uri="http://schemas.openxmlformats.org/drawingml/2006/picture">
                 <pic:pic xmlns:pic="http://schemas.openxmlformats.org/drawingml/2006/picture">
                   <pic:nvPicPr>
-                    <pic:cNvPr id="0" name="kientruc_cskh_chevron.png"/>
+                    <pic:cNvPr id="0" name="CSKH_Hinh_3_9_0_KienTrucQuyTrinh.png"/>
                     <pic:cNvPicPr/>
                   </pic:nvPicPr>
                   <pic:blipFill>
@@ -283,10 +283,6 @@
     <w:p>
       <w:pPr>
         <w:spacing w:before="40" w:after="80"/>
-        <w:rPr>
-          <w:rFonts w:ascii="Times New Roman" w:hAnsi="Times New Roman"/>
-          <w:color w:val="000000"/>
-        </w:rPr>
       </w:pPr>
       <w:r>
         <w:rPr>
@@ -298,15 +294,16 @@
     </w:p>
     <w:p>
       <w:pPr>
-        <w:spacing w:before="40" w:after="80"/>
+        <w:spacing w:before="80" w:after="40"/>
+        <w:jc w:val="center"/>
       </w:pPr>
       <w:r>
         <w:lastRenderedPageBreak/>
         <w:drawing>
-          <wp:inline distT="0" distB="0" distL="0" distR="0" wp14:anchorId="7764251C" wp14:editId="7591D024">
-            <wp:extent cx="5943600" cy="2354580"/>
-            <wp:effectExtent l="0" t="0" r="0" b="7620"/>
-            <wp:docPr id="893028836" name="Picture 1"/>
+          <wp:inline distT="0" distB="0" distL="0" distR="0" wp14:anchorId="5C1ABF38" wp14:editId="1FD77F4A">
+            <wp:extent cx="5943600" cy="2375535"/>
+            <wp:effectExtent l="0" t="0" r="0" b="5715"/>
+            <wp:docPr id="462159032" name="Picture 1"/>
             <wp:cNvGraphicFramePr>
               <a:graphicFrameLocks xmlns:a="http://schemas.openxmlformats.org/drawingml/2006/main" noChangeAspect="1"/>
             </wp:cNvGraphicFramePr>
@@ -314,7 +311,7 @@
               <a:graphicData uri="http://schemas.openxmlformats.org/drawingml/2006/picture">
                 <pic:pic xmlns:pic="http://schemas.openxmlformats.org/drawingml/2006/picture">
                   <pic:nvPicPr>
-                    <pic:cNvPr id="893028836" name=""/>
+                    <pic:cNvPr id="462159032" name=""/>
                     <pic:cNvPicPr/>
                   </pic:nvPicPr>
                   <pic:blipFill>
@@ -326,7 +323,7 @@
                   <pic:spPr>
                     <a:xfrm>
                       <a:off x="0" y="0"/>
-                      <a:ext cx="5943600" cy="2354580"/>
+                      <a:ext cx="5943600" cy="2375535"/>
                     </a:xfrm>
                     <a:prstGeom prst="rect">
                       <a:avLst/>
@@ -5299,12 +5296,11 @@
         <w:rPr>
           <w:noProof/>
         </w:rPr>
-        <w:lastRenderedPageBreak/>
         <w:drawing>
-          <wp:inline distT="0" distB="0" distL="0" distR="0" wp14:anchorId="13CEE093" wp14:editId="028A1EDA">
-            <wp:extent cx="5669280" cy="3023616"/>
+          <wp:inline distT="0" distB="0" distL="0" distR="0" wp14:anchorId="243630CB" wp14:editId="4DFAAEB1">
+            <wp:extent cx="5669280" cy="1889760"/>
             <wp:effectExtent l="0" t="0" r="0" b="0"/>
-            <wp:docPr id="2" name="Picture 2"/>
+            <wp:docPr id="3" name="Picture 3"/>
             <wp:cNvGraphicFramePr>
               <a:graphicFrameLocks xmlns:a="http://schemas.openxmlformats.org/drawingml/2006/main" noChangeAspect="1"/>
             </wp:cNvGraphicFramePr>
@@ -5312,7 +5308,7 @@
               <a:graphicData uri="http://schemas.openxmlformats.org/drawingml/2006/picture">
                 <pic:pic xmlns:pic="http://schemas.openxmlformats.org/drawingml/2006/picture">
                   <pic:nvPicPr>
-                    <pic:cNvPr id="0" name="why_why_1.png"/>
+                    <pic:cNvPr id="0" name="CSKH_Hinh_3_9_2_WhyWhy_ThoiGianChoXacMinh.png"/>
                     <pic:cNvPicPr/>
                   </pic:nvPicPr>
                   <pic:blipFill>
@@ -5324,7 +5320,7 @@
                   <pic:spPr>
                     <a:xfrm>
                       <a:off x="0" y="0"/>
-                      <a:ext cx="5669280" cy="3023616"/>
+                      <a:ext cx="5669280" cy="1889760"/>
                     </a:xfrm>
                     <a:prstGeom prst="rect">
                       <a:avLst/>
@@ -5376,11 +5372,12 @@
         <w:rPr>
           <w:noProof/>
         </w:rPr>
+        <w:lastRenderedPageBreak/>
         <w:drawing>
-          <wp:inline distT="0" distB="0" distL="0" distR="0" wp14:anchorId="07CE548F" wp14:editId="118EB0BF">
-            <wp:extent cx="5669280" cy="3023616"/>
+          <wp:inline distT="0" distB="0" distL="0" distR="0" wp14:anchorId="250C9910" wp14:editId="6F58CFB4">
+            <wp:extent cx="5669280" cy="1889760"/>
             <wp:effectExtent l="0" t="0" r="0" b="0"/>
-            <wp:docPr id="3" name="Picture 3"/>
+            <wp:docPr id="4" name="Picture 4"/>
             <wp:cNvGraphicFramePr>
               <a:graphicFrameLocks xmlns:a="http://schemas.openxmlformats.org/drawingml/2006/main" noChangeAspect="1"/>
             </wp:cNvGraphicFramePr>
@@ -5388,7 +5385,7 @@
               <a:graphicData uri="http://schemas.openxmlformats.org/drawingml/2006/picture">
                 <pic:pic xmlns:pic="http://schemas.openxmlformats.org/drawingml/2006/picture">
                   <pic:nvPicPr>
-                    <pic:cNvPr id="0" name="why_why_2.png"/>
+                    <pic:cNvPr id="0" name="CSKH_Hinh_3_9_3_WhyWhy_SaiSotChungTuKhieuNai.png"/>
                     <pic:cNvPicPr/>
                   </pic:nvPicPr>
                   <pic:blipFill>
@@ -5400,7 +5397,7 @@
                   <pic:spPr>
                     <a:xfrm>
                       <a:off x="0" y="0"/>
-                      <a:ext cx="5669280" cy="3023616"/>
+                      <a:ext cx="5669280" cy="1889760"/>
                     </a:xfrm>
                     <a:prstGeom prst="rect">
                       <a:avLst/>
@@ -5491,7 +5488,6 @@
           <w:b/>
           <w:color w:val="000000"/>
         </w:rPr>
-        <w:lastRenderedPageBreak/>
         <w:t>Thời gian xử lý:</w:t>
       </w:r>
     </w:p>
@@ -6410,6 +6406,7 @@
                 <w:rFonts w:ascii="Times New Roman" w:hAnsi="Times New Roman"/>
                 <w:color w:val="000000"/>
               </w:rPr>
+              <w:lastRenderedPageBreak/>
               <w:t>Chờ duyệt đền bù</w:t>
             </w:r>
           </w:p>
@@ -6971,7 +6968,6 @@
                 <w:rFonts w:ascii="Times New Roman" w:hAnsi="Times New Roman"/>
                 <w:color w:val="000000"/>
               </w:rPr>
-              <w:lastRenderedPageBreak/>
               <w:t>6. Thông báo</w:t>
             </w:r>
           </w:p>
@@ -7317,31 +7313,31 @@
       </w:rPr>
     </w:lvl>
   </w:abstractNum>
-  <w:num w:numId="1" w16cid:durableId="310403605">
+  <w:num w:numId="1" w16cid:durableId="2030329907">
     <w:abstractNumId w:val="8"/>
   </w:num>
-  <w:num w:numId="2" w16cid:durableId="1730575337">
+  <w:num w:numId="2" w16cid:durableId="1960717438">
     <w:abstractNumId w:val="6"/>
   </w:num>
-  <w:num w:numId="3" w16cid:durableId="1212498815">
+  <w:num w:numId="3" w16cid:durableId="543903257">
     <w:abstractNumId w:val="5"/>
   </w:num>
-  <w:num w:numId="4" w16cid:durableId="798763680">
+  <w:num w:numId="4" w16cid:durableId="1433670302">
     <w:abstractNumId w:val="4"/>
   </w:num>
-  <w:num w:numId="5" w16cid:durableId="1809349934">
+  <w:num w:numId="5" w16cid:durableId="973632330">
     <w:abstractNumId w:val="7"/>
   </w:num>
-  <w:num w:numId="6" w16cid:durableId="1442918417">
+  <w:num w:numId="6" w16cid:durableId="1814981703">
     <w:abstractNumId w:val="3"/>
   </w:num>
-  <w:num w:numId="7" w16cid:durableId="1804687617">
+  <w:num w:numId="7" w16cid:durableId="1980917888">
     <w:abstractNumId w:val="2"/>
   </w:num>
-  <w:num w:numId="8" w16cid:durableId="458451674">
+  <w:num w:numId="8" w16cid:durableId="880869575">
     <w:abstractNumId w:val="1"/>
   </w:num>
-  <w:num w:numId="9" w16cid:durableId="1499156760">
+  <w:num w:numId="9" w16cid:durableId="14885961">
     <w:abstractNumId w:val="0"/>
   </w:num>
 </w:numbering>

</xml_diff>